<commit_message>
Legacy content cleanup — regenerated templates, aligned docs/downloads with templates/
- Regenerated all xlsx templates from cleaned csv sources
- Re-stamped manifest.json with the current vocabulary (action/memory/flow)
- Fixed scripts/create_templates.py source of scope-document.xlsx legacy content
- Propagated clean binaries to docs/downloads/ (previously even more stale than templates/)
- Replaced 'Core banking vendor' example in personalise/prompts/learning/csm-discovery.md
- .github/workflows/deploy.yml: Node.js 24 opt-in to remove deprecation warnings
</commit_message>
<xml_diff>
--- a/docs/downloads/Stage 3 - Scope - Template.docx
+++ b/docs/downloads/Stage 3 - Scope - Template.docx
@@ -136,7 +136,7 @@
     </w:p>
     <w:p>
       <w:r>
-        <w:t>Once completed, this document feeds directly into Stage 4 (Design), where every step, data source, and decision point you record here is translated into a LangGraph agent architecture. The quality of the design is entirely determined by the quality of this scope.</w:t>
+        <w:t>Once completed, this document feeds directly into Stage 4 (Design), where every step, data source, and decision point you record here is translated into an agent architecture on the platform your team has chosen. The quality of the design is entirely determined by the quality of this scope.</w:t>
       </w:r>
     </w:p>
     <w:p>
@@ -432,7 +432,7 @@
         <w:t xml:space="preserve">Step-by-Step Workflow Map: </w:t>
       </w:r>
       <w:r>
-        <w:t>The sequence of steps, with decision logic and boundary tags, that becomes the node/edge structure of the LangGraph agent.</w:t>
+        <w:t>The sequence of steps, with decision logic and boundary tags, that becomes the action/flow structure of the agent.</w:t>
       </w:r>
     </w:p>
     <w:p>
@@ -443,7 +443,7 @@
         <w:t xml:space="preserve">Data Inventory: </w:t>
       </w:r>
       <w:r>
-        <w:t>The list of data sources that becomes the tool specification for each data-retrieval node.</w:t>
+        <w:t>The list of data sources that becomes the tool specification for each data-retrieval action.</w:t>
       </w:r>
     </w:p>
     <w:p>
@@ -465,7 +465,7 @@
         <w:t xml:space="preserve">Constraints and Assumptions: </w:t>
       </w:r>
       <w:r>
-        <w:t>The operating conditions that shape the state schema, error handling strategy, and scope limitations of the agent design.</w:t>
+        <w:t>The operating conditions that shape the memory schema, error handling strategy, and scope limitations of the agent design.</w:t>
       </w:r>
     </w:p>
     <w:p>
@@ -615,7 +615,7 @@
           <w:color w:val="1E7D32"/>
           <w:sz w:val="20"/>
         </w:rPr>
-        <w:t>A good scope summary answers: What is the workflow? Who does it? How often? What does it produce? For example: 'The Quarterly Account Health Review is performed by Customer Success Directors once per quarter for each account in their portfolio. It synthesises data from CRM, support, product usage, and Slack into a scored health report with executive summary, distributed to account stakeholders.'</w:t>
+        <w:t>A good scope summary answers: What is the workflow? Who does it? How often? What does it produce? For example: 'The Quarterly Account Health Review is performed by Customer Success Managers once per quarter for each account in their portfolio. It synthesises data from CRM, support, product usage, and Slack into a scored health report with executive summary, distributed to account stakeholders.'</w:t>
       </w:r>
     </w:p>
     <w:p>
@@ -2193,13 +2193,13 @@
           <w:color w:val="666666"/>
           <w:sz w:val="20"/>
         </w:rPr>
-        <w:t>For each step where the boundary assignment is not obvious (especially HIL and MANUAL steps, and any split-boundary steps), write a brief narrative explaining why you chose that boundary. This rationale is critical for Stage 4 — it determines which steps become automated nodes vs. interrupt checkpoints.</w:t>
+        <w:t>For each step where the boundary assignment is not obvious (especially HIL and MANUAL steps, and any split-boundary steps), write a brief narrative explaining why you chose that boundary. This rationale is critical for Stage 4 — it determines which steps become automated actions vs. HIL checkpoints.</w:t>
         <w:br/>
         <w:br/>
-        <w:t>Example: 'Step 5 (Slack sentiment) is HIL because Slack conversations contain sarcasm, inside jokes, and genuine complaints mixed together. The LLM can summarise and propose a sentiment reading, but the CSD knows the relationship context. The agent does the heavy lifting; the human validates.'</w:t>
+        <w:t>Example: 'Step 5 (Slack sentiment) is HIL because Slack conversations contain sarcasm, inside jokes, and genuine complaints mixed together. The LLM can summarise and propose a sentiment reading, but the CSM knows the relationship context. The agent does the heavy lifting; the human validates.'</w:t>
         <w:br/>
         <w:br/>
-        <w:t>Example: 'Step 12 (distribution) is MANUAL because once the report is sent, it is sent. The CSD needs final judgement on tone, completeness, and distribution list. This is a deliberate safety boundary.'</w:t>
+        <w:t>Example: 'Step 12 (distribution) is MANUAL because once the report is sent, it is sent. The CSM needs final judgement on tone, completeness, and distribution list. This is a deliberate safety boundary.'</w:t>
       </w:r>
     </w:p>
     <w:p>
@@ -2217,7 +2217,7 @@
     </w:p>
     <w:p>
       <w:r>
-        <w:t>Document every data source your workflow touches. This inventory becomes the tool specification for data-retrieval nodes in Stage 4 and the integration setup checklist in Stage 5.</w:t>
+        <w:t>Document every data source your workflow touches. This inventory becomes the tool specification for data-retrieval actions in Stage 4 and the integration setup checklist in Stage 5.</w:t>
       </w:r>
     </w:p>
     <w:tbl>
@@ -3417,7 +3417,7 @@
               <w:rPr>
                 <w:sz w:val="17"/>
               </w:rPr>
-              <w:t>LangGraph — agent orchestration</w:t>
+              <w:t>Agent orchestration framework</w:t>
             </w:r>
           </w:p>
         </w:tc>
@@ -3436,7 +3436,7 @@
               <w:rPr>
                 <w:sz w:val="17"/>
               </w:rPr>
-              <w:t>LangGraph ≥0.2 (Python)</w:t>
+              <w:t>Whichever framework your team has chosen</w:t>
             </w:r>
           </w:p>
         </w:tc>
@@ -3493,7 +3493,7 @@
               <w:rPr>
                 <w:sz w:val="17"/>
               </w:rPr>
-              <w:t>Core dependency. Workflow steps become LangGraph nodes. Install via pip install langgraph.</w:t>
+              <w:t>Core dependency. Workflow steps become flow actions. Installation depends on the chosen platform — see Stage 4.</w:t>
             </w:r>
           </w:p>
         </w:tc>
@@ -3533,7 +3533,7 @@
               <w:rPr>
                 <w:sz w:val="17"/>
               </w:rPr>
-              <w:t>Anthropic SDK — Claude API for synthesis, summarisation, report generation</w:t>
+              <w:t>Language model API access for synthesis, summarisation, report generation</w:t>
             </w:r>
           </w:p>
         </w:tc>
@@ -3552,7 +3552,7 @@
               <w:rPr>
                 <w:sz w:val="17"/>
               </w:rPr>
-              <w:t>Anthropic Python SDK ≥0.39</w:t>
+              <w:t>A capable general-purpose LLM available via API</w:t>
             </w:r>
           </w:p>
         </w:tc>
@@ -3609,7 +3609,7 @@
               <w:rPr>
                 <w:sz w:val="17"/>
               </w:rPr>
-              <w:t>Required for synthesis and judgement steps. API key must be provisioned and stored securely.</w:t>
+              <w:t>Required for synthesis and judgement steps. API credentials must be provisioned and stored securely.</w:t>
             </w:r>
           </w:p>
         </w:tc>
@@ -4700,7 +4700,7 @@
               <w:rPr>
                 <w:sz w:val="17"/>
               </w:rPr>
-              <w:t>Stage 3 (workflow map), Stage 4 (state schema needs product loop), Stage 5 (scoring rubric needs per-product dimensions)</w:t>
+              <w:t>Stage 3 (workflow map), Stage 4 (memory schema needs product loop), Stage 5 (scoring rubric needs per-product dimensions)</w:t>
             </w:r>
           </w:p>
         </w:tc>
@@ -4932,7 +4932,7 @@
               <w:rPr>
                 <w:sz w:val="17"/>
               </w:rPr>
-              <w:t>Stage 3 (date range params need freshness checks), Stage 5 (retrieval nodes need configurable dates)</w:t>
+              <w:t>Stage 3 (date range params need freshness checks), Stage 5 (retrieval actions need configurable dates)</w:t>
             </w:r>
           </w:p>
         </w:tc>
@@ -5540,7 +5540,7 @@
         <w:t xml:space="preserve">2. Hand off to Stage 4: Design. </w:t>
       </w:r>
       <w:r>
-        <w:t>The completed Scope Document is the primary input for Stage 4, where the workflow map is translated into a LangGraph agent architecture. The designer will use your step-by-step map to define nodes and edges, your boundary tags to place interrupt checkpoints, your data inventory to specify tools, and your constraints to shape the state schema.</w:t>
+        <w:t>The completed Scope Document is the primary input for Stage 4, where the workflow map is translated into an agent architecture on the platform your team has chosen. The designer will use your step-by-step map to define actions and edges, your boundary tags to place HIL checkpoints, your data inventory to specify tools, and your constraints to shape the memory schema.</w:t>
       </w:r>
     </w:p>
     <w:p>

</xml_diff>